<commit_message>
Add repository link to lab 7 report
</commit_message>
<xml_diff>
--- a/output/docx/Горбачев_ДВ_Отчет_практическая_работа_7.docx
+++ b/output/docx/Горбачев_ДВ_Отчет_практическая_работа_7.docx
@@ -217,9 +217,16 @@
         </w:rPr>
         <w:t xml:space="preserve">Ссылка на репозиторий: </w:t>
       </w:r>
-      <w:r>
-        <w:t>________________________________</w:t>
-      </w:r>
+      <w:hyperlink r:id="rId11">
+        <w:r>
+          <w:rPr>
+            <w:rStyle w:val="Hyperlink"/>
+            <w:color w:val="0563C1"/>
+            <w:u w:val="single"/>
+          </w:rPr>
+          <w:t>https://github.com/Mahmud52Ali/java/tree/feat/pr_07</w:t>
+        </w:r>
+      </w:hyperlink>
     </w:p>
     <w:p>
       <w:pPr>

</xml_diff>